<commit_message>
Write-up: Q5 was run live and passed
Co-Authored-By: Claude Sonnet 5.5 <noreply@anthropic.com>
</commit_message>
<xml_diff>
--- a/docs/Wellspring-Writeup.docx
+++ b/docs/Wellspring-Writeup.docx
@@ -176,6 +176,70 @@
       </w:r>
       <w:r>
         <w:t>Shared memory is an append-only overlay: corrections to one inspection, rules for one well type, statements about one well; each attributed to its author with a reason and applied only at its scope. Private memory (each user's conversations and display preferences) is only ever read for that user; the API returns 404 for anyone else's chat.</w:t>
+      </w:r>
+    </w:p>
+    <w:p>
+      <w:pPr>
+        <w:pStyle w:val="Heading2"/>
+      </w:pPr>
+      <w:r>
+        <w:t>Stack at a glance</w:t>
+      </w:r>
+    </w:p>
+    <w:p>
+      <w:pPr>
+        <w:pStyle w:val="ListBullet"/>
+      </w:pPr>
+      <w:r>
+        <w:rPr>
+          <w:b/>
+        </w:rPr>
+        <w:t xml:space="preserve">Frontend. </w:t>
+      </w:r>
+      <w:r>
+        <w:t>A React and Vite chat app with a user picker, light and dark themes, and inline visuals (card, table, line, bar, stacked bar, map, heatmap). Every chart can switch to a table view, and status colors always come with an icon and a label.</w:t>
+      </w:r>
+    </w:p>
+    <w:p>
+      <w:pPr>
+        <w:pStyle w:val="ListBullet"/>
+      </w:pPr>
+      <w:r>
+        <w:rPr>
+          <w:b/>
+        </w:rPr>
+        <w:t xml:space="preserve">Backend. </w:t>
+      </w:r>
+      <w:r>
+        <w:t>A FastAPI service around a provider-neutral agent loop. The default model is Gemma 4 on local Ollama, free; Claude, OpenRouter or Gemini can be swapped in with one environment variable. Privacy is enforced in the API: every conversation query is filtered by user, and anyone else's chat returns 404.</w:t>
+      </w:r>
+    </w:p>
+    <w:p>
+      <w:pPr>
+        <w:pStyle w:val="ListBullet"/>
+      </w:pPr>
+      <w:r>
+        <w:rPr>
+          <w:b/>
+        </w:rPr>
+        <w:t xml:space="preserve">Data flow. </w:t>
+      </w:r>
+      <w:r>
+        <w:t>The loader parses the raw records, repair reports, manuals and SOPs into SQLite, along with each rule's source. A question goes to the agent, which calls the typed tools. The tools run SQL over the views, which apply corrections on top of the raw data and keep the originals. Each tool returns rows, evidence, ready-made visuals and flags. The agent writes the text and picks a visual from a tool result, and the conversation is saved in that user's private memory.</w:t>
+      </w:r>
+    </w:p>
+    <w:p>
+      <w:pPr>
+        <w:pStyle w:val="ListBullet"/>
+      </w:pPr>
+      <w:r>
+        <w:rPr>
+          <w:b/>
+        </w:rPr>
+        <w:t xml:space="preserve">QA. </w:t>
+      </w:r>
+      <w:r>
+        <w:t>A separate ground-truth implementation recomputes the expected answers straight from the raw files. 136 automated tests in CI check parity across all 600 wells, every tool, privacy and the agent loop. A smoke check runs every tool on any new dataset. Eval scripts score real model answers against expected facts and visuals.</w:t>
       </w:r>
     </w:p>
     <w:p>
@@ -551,7 +615,7 @@
               <w:rPr>
                 <w:sz w:val="19"/>
               </w:rPr>
-              <w:t>Not run in time</w:t>
+              <w:t>Correct, 6 spills and 3 not compliant (4 min)</w:t>
             </w:r>
           </w:p>
         </w:tc>

</xml_diff>